<commit_message>
added figma link to documentation
</commit_message>
<xml_diff>
--- a/Thatcher Project Documentation.docx
+++ b/Thatcher Project Documentation.docx
@@ -144,6 +144,19 @@
           <w:lang w:val="en-US"/>
         </w:rPr>
         <w:t>Figma Prototype</w:t>
+      </w:r>
+    </w:p>
+    <w:p>
+      <w:pPr>
+        <w:rPr>
+          <w:lang w:val="en-US"/>
+        </w:rPr>
+      </w:pPr>
+      <w:r>
+        <w:rPr>
+          <w:lang w:val="en-US"/>
+        </w:rPr>
+        <w:t>https://www.figma.com/design/JLDyWIjABAIjeura8rTbe9/Parking-App-design--Copy-?node-id=38-1105&amp;t=VfjjMEEIV3yEC7ND-0</w:t>
       </w:r>
     </w:p>
     <w:sectPr>
@@ -758,6 +771,7 @@
   <w:style w:type="character" w:default="1" w:styleId="DefaultParagraphFont">
     <w:name w:val="Default Paragraph Font"/>
     <w:uiPriority w:val="1"/>
+    <w:semiHidden/>
     <w:unhideWhenUsed/>
   </w:style>
   <w:style w:type="table" w:default="1" w:styleId="TableNormal">

</xml_diff>

<commit_message>
added trello link to document
</commit_message>
<xml_diff>
--- a/Thatcher Project Documentation.docx
+++ b/Thatcher Project Documentation.docx
@@ -56,6 +56,43 @@
         <w:rPr>
           <w:lang w:val="en-US"/>
         </w:rPr>
+        <w:t>Planning and organization</w:t>
+      </w:r>
+    </w:p>
+    <w:p>
+      <w:pPr>
+        <w:rPr>
+          <w:lang w:val="en-US"/>
+        </w:rPr>
+      </w:pPr>
+      <w:hyperlink r:id="rId4" w:history="1">
+        <w:r>
+          <w:rPr>
+            <w:rStyle w:val="Hyperlink"/>
+            <w:lang w:val="en-US"/>
+          </w:rPr>
+          <w:t>https://trello.com/b/U9jtPjdb/thatcher-project</w:t>
+        </w:r>
+      </w:hyperlink>
+    </w:p>
+    <w:p>
+      <w:pPr>
+        <w:rPr>
+          <w:lang w:val="en-US"/>
+        </w:rPr>
+      </w:pPr>
+    </w:p>
+    <w:p>
+      <w:pPr>
+        <w:pStyle w:val="Heading2"/>
+        <w:rPr>
+          <w:lang w:val="en-US"/>
+        </w:rPr>
+      </w:pPr>
+      <w:r>
+        <w:rPr>
+          <w:lang w:val="en-US"/>
+        </w:rPr>
         <w:t>Tech Stack</w:t>
       </w:r>
     </w:p>
@@ -95,7 +132,7 @@
         </w:rPr>
         <w:t xml:space="preserve"> recognition. After some research into different facial recognition python libraries </w:t>
       </w:r>
-      <w:hyperlink r:id="rId4" w:history="1">
+      <w:hyperlink r:id="rId5" w:history="1">
         <w:r>
           <w:rPr>
             <w:rStyle w:val="Hyperlink"/>

</xml_diff>